<commit_message>
Reorganize Riemann Zeta sources under numbered research map
</commit_message>
<xml_diff>
--- a/Riemann Zeta/Guth_Maynard_Formalization_Research_Agenda.docx
+++ b/Riemann Zeta/Guth_Maynard_Formalization_Research_Agenda.docx
@@ -3843,7 +3843,7 @@
                 <w:rFonts w:ascii="Cascadia Mono" w:hAnsi="Cascadia Mono" w:eastAsia="Cascadia Mono"/>
                 <w:sz w:val="15"/>
               </w:rPr>
-              <w:t>RiemannZeta/</w:t>
+              <w:t>9. Zero Density, Large Values and Prime Transfer/71 Guth-Maynard, 2026/RiemannZeta/</w:t>
             </w:r>
             <w:r>
               <w:br/>
@@ -6030,7 +6030,7 @@
         <w:t xml:space="preserve">2. </w:t>
       </w:r>
       <w:r>
-        <w:t>Run lake build and lake env lean RiemannZeta/Audit.lean from a clean environment. Save the exact result in the working notes.</w:t>
+        <w:t>Run lake build and lake env lean "9. Zero Density, Large Values and Prime Transfer/71 Guth-Maynard, 2026/RiemannZeta/Audit.lean" from a clean environment. Save the exact result in the working notes.</w:t>
       </w:r>
     </w:p>
     <w:p>

</xml_diff>